<commit_message>
Auto sync 2026-06-03 16:29:50
</commit_message>
<xml_diff>
--- a/杭州楼市26年物料/2026年杭州买房全政策详细分析.docx
+++ b/杭州楼市26年物料/2026年杭州买房全政策详细分析.docx
@@ -888,7 +888,7 @@
           <w:rFonts w:ascii="Microsoft YaHei" w:hAnsi="Microsoft YaHei" w:eastAsia="Microsoft YaHei"/>
           <w:sz w:val="21"/>
         </w:rPr>
-        <w:t>2026年5月杭州二手房成交：第一财经，2026-06-02。https://www.yicai.com/news/103211762.html</w:t>
+        <w:t>2026年5月杭州二手房成交：杭州网/都市快报，2026-06-02。https://hznews.hangzhou.com.cn/chengshi/content/2026-06/02/content_9232622.htm</w:t>
       </w:r>
     </w:p>
     <w:p>
@@ -901,7 +901,7 @@
           <w:rFonts w:ascii="Microsoft YaHei" w:hAnsi="Microsoft YaHei" w:eastAsia="Microsoft YaHei"/>
           <w:sz w:val="21"/>
         </w:rPr>
-        <w:t>2026年4月杭州二手房成交：杭州网房产频道，2026-05-30。https://house.hangzhou.com.cn/content/2026-05/30/content_9231466.html</w:t>
+        <w:t>2026年4月杭州二手房成交：杭州网房产频道/都市快报，2026-05-05。https://house.hangzhou.com.cn/content/2026-05/05/content_9216540.html</w:t>
       </w:r>
     </w:p>
     <w:sectPr>

</xml_diff>